<commit_message>
fix: corregir modelo IA para Groq (qwen-2.5-32b)
</commit_message>
<xml_diff>
--- a/INFORME_David_Malquin.docx
+++ b/INFORME_David_Malquin.docx
@@ -79,7 +79,7 @@
         <w:t xml:space="preserve"> </w:t>
       </w:r>
       <w:r>
-        <w:t xml:space="preserve">Estrategia y Gestión de Servicios de TI</w:t>
+        <w:t xml:space="preserve">ESTRATEGIA, GESTIÓN Y ADQUISICIÓN EN LOS SISTEMAS</w:t>
       </w:r>
     </w:p>
     <w:p>
@@ -129,7 +129,7 @@
         <w:t xml:space="preserve"> </w:t>
       </w:r>
       <w:r>
-        <w:t xml:space="preserve">Julio 2026</w:t>
+        <w:t xml:space="preserve">20 de Julio de 2026</w:t>
       </w:r>
     </w:p>
     <w:p>
@@ -6121,7 +6121,7 @@
           <w:i/>
           <w:iCs/>
         </w:rPr>
-        <w:t xml:space="preserve">Documento generado para la materia de Estrategia y Gestión de Servicios de TI</w:t>
+        <w:t xml:space="preserve">Documento generado para la materia de ESTRATEGIA, GESTIÓN Y ADQUISICIÓN EN LOS SISTEMAS</w:t>
       </w:r>
       <w:r>
         <w:br/>
@@ -6141,7 +6141,7 @@
           <w:i/>
           <w:iCs/>
         </w:rPr>
-        <w:t xml:space="preserve">Universidad Central del Ecuador — Julio 2026</w:t>
+        <w:t xml:space="preserve">Universidad Central del Ecuador — 20 de Julio de 2026</w:t>
       </w:r>
       <w:r>
         <w:br/>

</xml_diff>